<commit_message>
Format synopsis and report in IEEE style
</commit_message>
<xml_diff>
--- a/docs/traffic_sign_recognition_project_report.docx
+++ b/docs/traffic_sign_recognition_project_report.docx
@@ -2,19 +2,12 @@
 <file path=word/document.xml><?xml version="1.0" encoding="utf-8"?>
 <w:document xmlns:wpc="http://schemas.microsoft.com/office/word/2010/wordprocessingCanvas" xmlns:mo="http://schemas.microsoft.com/office/mac/office/2008/main" xmlns:mc="http://schemas.openxmlformats.org/markup-compatibility/2006" xmlns:mv="urn:schemas-microsoft-com:mac:vml" xmlns:o="urn:schemas-microsoft-com:office:office" xmlns:r="http://schemas.openxmlformats.org/officeDocument/2006/relationships" xmlns:m="http://schemas.openxmlformats.org/officeDocument/2006/math" xmlns:v="urn:schemas-microsoft-com:vml" xmlns:wp14="http://schemas.microsoft.com/office/word/2010/wordprocessingDrawing" xmlns:wp="http://schemas.openxmlformats.org/drawingml/2006/wordprocessingDrawing" xmlns:w10="urn:schemas-microsoft-com:office:word" xmlns:w="http://schemas.openxmlformats.org/wordprocessingml/2006/main" xmlns:w14="http://schemas.microsoft.com/office/word/2010/wordml" xmlns:wpg="http://schemas.microsoft.com/office/word/2010/wordprocessingGroup" xmlns:wpi="http://schemas.microsoft.com/office/word/2010/wordprocessingInk" xmlns:wne="http://schemas.microsoft.com/office/word/2006/wordml" xmlns:wps="http://schemas.microsoft.com/office/word/2010/wordprocessingShape" mc:Ignorable="w14 wp14">
   <w:body>
-    <w:p/>
-    <w:p/>
-    <w:p/>
     <w:p>
       <w:pPr>
+        <w:pStyle w:val="Title"/>
         <w:jc w:val="center"/>
       </w:pPr>
       <w:r>
-        <w:rPr>
-          <w:b/>
-          <w:color w:val="173B57"/>
-          <w:sz w:val="56"/>
-        </w:rPr>
         <w:t>Project Report</w:t>
       </w:r>
     </w:p>
@@ -24,49 +17,26 @@
       </w:pPr>
       <w:r>
         <w:rPr>
-          <w:color w:val="0F766E"/>
-          <w:sz w:val="30"/>
+          <w:rFonts w:ascii="Times New Roman" w:hAnsi="Times New Roman"/>
+          <w:color w:val="000000"/>
+          <w:sz w:val="22"/>
         </w:rPr>
         <w:t>GTSRB Traffic-Sign Recognition</w:t>
       </w:r>
     </w:p>
-    <w:p/>
     <w:p>
       <w:pPr>
         <w:jc w:val="center"/>
       </w:pPr>
       <w:r>
         <w:rPr>
-          <w:sz w:val="24"/>
+          <w:rFonts w:ascii="Times New Roman" w:hAnsi="Times New Roman"/>
+          <w:sz w:val="20"/>
         </w:rPr>
-        <w:t>A complete, reproducible TensorFlow/Keras pipeline for the 43-class German Traffic Sign Recognition Benchmark.</w:t>
+        <w:t>Akshit Mehta</w:t>
       </w:r>
     </w:p>
     <w:p/>
-    <w:p/>
-    <w:p/>
-    <w:p/>
-    <w:p/>
-    <w:p/>
-    <w:p/>
-    <w:p>
-      <w:pPr>
-        <w:jc w:val="center"/>
-      </w:pPr>
-      <w:r>
-        <w:rPr>
-          <w:sz w:val="22"/>
-        </w:rPr>
-        <w:t>Prepared for academic/project documentation</w:t>
-        <w:br/>
-        <w:t>September 2026</w:t>
-      </w:r>
-    </w:p>
-    <w:p>
-      <w:r>
-        <w:br w:type="page"/>
-      </w:r>
-    </w:p>
     <w:p>
       <w:pPr>
         <w:pStyle w:val="Heading1"/>
@@ -122,18 +92,19 @@
     <w:tbl>
       <w:tblPr>
         <w:tblStyle w:val="TableGrid"/>
-        <w:tblW w:type="auto" w:w="0"/>
+        <w:tblW w:type="dxa" w:w="4536"/>
         <w:jc w:val="center"/>
+        <w:tblLayout w:type="fixed"/>
         <w:tblLook w:firstColumn="1" w:firstRow="1" w:lastColumn="0" w:lastRow="0" w:noHBand="0" w:noVBand="1" w:val="04A0"/>
       </w:tblPr>
       <w:tblGrid>
-        <w:gridCol w:w="5040"/>
-        <w:gridCol w:w="5040"/>
+        <w:gridCol w:w="2268"/>
+        <w:gridCol w:w="2268"/>
       </w:tblGrid>
       <w:tr>
         <w:tc>
           <w:tcPr>
-            <w:tcW w:type="dxa" w:w="5040"/>
+            <w:tcW w:type="dxa" w:w="2268"/>
             <w:shd w:fill="173B57"/>
             <w:vAlign w:val="center"/>
           </w:tcPr>
@@ -151,7 +122,7 @@
         </w:tc>
         <w:tc>
           <w:tcPr>
-            <w:tcW w:type="dxa" w:w="5040"/>
+            <w:tcW w:type="dxa" w:w="2268"/>
             <w:shd w:fill="173B57"/>
             <w:vAlign w:val="center"/>
           </w:tcPr>
@@ -171,7 +142,7 @@
       <w:tr>
         <w:tc>
           <w:tcPr>
-            <w:tcW w:type="dxa" w:w="5040"/>
+            <w:tcW w:type="dxa" w:w="2268"/>
             <w:vAlign w:val="center"/>
           </w:tcPr>
           <w:p>
@@ -188,7 +159,7 @@
         </w:tc>
         <w:tc>
           <w:tcPr>
-            <w:tcW w:type="dxa" w:w="5040"/>
+            <w:tcW w:type="dxa" w:w="2268"/>
             <w:vAlign w:val="center"/>
           </w:tcPr>
           <w:p>
@@ -207,7 +178,7 @@
       <w:tr>
         <w:tc>
           <w:tcPr>
-            <w:tcW w:type="dxa" w:w="5040"/>
+            <w:tcW w:type="dxa" w:w="2268"/>
             <w:vAlign w:val="center"/>
           </w:tcPr>
           <w:p>
@@ -224,7 +195,7 @@
         </w:tc>
         <w:tc>
           <w:tcPr>
-            <w:tcW w:type="dxa" w:w="5040"/>
+            <w:tcW w:type="dxa" w:w="2268"/>
             <w:vAlign w:val="center"/>
           </w:tcPr>
           <w:p>
@@ -243,7 +214,7 @@
       <w:tr>
         <w:tc>
           <w:tcPr>
-            <w:tcW w:type="dxa" w:w="5040"/>
+            <w:tcW w:type="dxa" w:w="2268"/>
             <w:vAlign w:val="center"/>
           </w:tcPr>
           <w:p>
@@ -260,7 +231,7 @@
         </w:tc>
         <w:tc>
           <w:tcPr>
-            <w:tcW w:type="dxa" w:w="5040"/>
+            <w:tcW w:type="dxa" w:w="2268"/>
             <w:vAlign w:val="center"/>
           </w:tcPr>
           <w:p>
@@ -279,7 +250,7 @@
       <w:tr>
         <w:tc>
           <w:tcPr>
-            <w:tcW w:type="dxa" w:w="5040"/>
+            <w:tcW w:type="dxa" w:w="2268"/>
             <w:vAlign w:val="center"/>
           </w:tcPr>
           <w:p>
@@ -296,7 +267,7 @@
         </w:tc>
         <w:tc>
           <w:tcPr>
-            <w:tcW w:type="dxa" w:w="5040"/>
+            <w:tcW w:type="dxa" w:w="2268"/>
             <w:vAlign w:val="center"/>
           </w:tcPr>
           <w:p>
@@ -315,7 +286,7 @@
       <w:tr>
         <w:tc>
           <w:tcPr>
-            <w:tcW w:type="dxa" w:w="5040"/>
+            <w:tcW w:type="dxa" w:w="2268"/>
             <w:vAlign w:val="center"/>
           </w:tcPr>
           <w:p>
@@ -332,7 +303,7 @@
         </w:tc>
         <w:tc>
           <w:tcPr>
-            <w:tcW w:type="dxa" w:w="5040"/>
+            <w:tcW w:type="dxa" w:w="2268"/>
             <w:vAlign w:val="center"/>
           </w:tcPr>
           <w:p>
@@ -351,7 +322,7 @@
       <w:tr>
         <w:tc>
           <w:tcPr>
-            <w:tcW w:type="dxa" w:w="5040"/>
+            <w:tcW w:type="dxa" w:w="2268"/>
             <w:vAlign w:val="center"/>
           </w:tcPr>
           <w:p>
@@ -368,7 +339,7 @@
         </w:tc>
         <w:tc>
           <w:tcPr>
-            <w:tcW w:type="dxa" w:w="5040"/>
+            <w:tcW w:type="dxa" w:w="2268"/>
             <w:vAlign w:val="center"/>
           </w:tcPr>
           <w:p>
@@ -393,7 +364,7 @@
       <w:r>
         <w:drawing>
           <wp:inline xmlns:a="http://schemas.openxmlformats.org/drawingml/2006/main" xmlns:pic="http://schemas.openxmlformats.org/drawingml/2006/picture">
-            <wp:extent cx="5623560" cy="5623560"/>
+            <wp:extent cx="2880360" cy="2880360"/>
             <wp:docPr id="1" name="Picture 1"/>
             <wp:cNvGraphicFramePr>
               <a:graphicFrameLocks noChangeAspect="1"/>
@@ -414,7 +385,7 @@
                   <pic:spPr>
                     <a:xfrm>
                       <a:off x="0" y="0"/>
-                      <a:ext cx="5623560" cy="5623560"/>
+                      <a:ext cx="2880360" cy="2880360"/>
                     </a:xfrm>
                     <a:prstGeom prst="rect"/>
                   </pic:spPr>
@@ -444,7 +415,7 @@
       <w:r>
         <w:drawing>
           <wp:inline xmlns:a="http://schemas.openxmlformats.org/drawingml/2006/main" xmlns:pic="http://schemas.openxmlformats.org/drawingml/2006/picture">
-            <wp:extent cx="5623560" cy="1874520"/>
+            <wp:extent cx="2880360" cy="960120"/>
             <wp:docPr id="2" name="Picture 2"/>
             <wp:cNvGraphicFramePr>
               <a:graphicFrameLocks noChangeAspect="1"/>
@@ -465,7 +436,7 @@
                   <pic:spPr>
                     <a:xfrm>
                       <a:off x="0" y="0"/>
-                      <a:ext cx="5623560" cy="1874520"/>
+                      <a:ext cx="2880360" cy="960120"/>
                     </a:xfrm>
                     <a:prstGeom prst="rect"/>
                   </pic:spPr>
@@ -508,7 +479,7 @@
       <w:r>
         <w:drawing>
           <wp:inline xmlns:a="http://schemas.openxmlformats.org/drawingml/2006/main" xmlns:pic="http://schemas.openxmlformats.org/drawingml/2006/picture">
-            <wp:extent cx="5623560" cy="2008414"/>
+            <wp:extent cx="2880360" cy="1028700"/>
             <wp:docPr id="3" name="Picture 3"/>
             <wp:cNvGraphicFramePr>
               <a:graphicFrameLocks noChangeAspect="1"/>
@@ -529,7 +500,7 @@
                   <pic:spPr>
                     <a:xfrm>
                       <a:off x="0" y="0"/>
-                      <a:ext cx="5623560" cy="2008414"/>
+                      <a:ext cx="2880360" cy="1028700"/>
                     </a:xfrm>
                     <a:prstGeom prst="rect"/>
                   </pic:spPr>
@@ -559,7 +530,7 @@
       <w:r>
         <w:drawing>
           <wp:inline xmlns:a="http://schemas.openxmlformats.org/drawingml/2006/main" xmlns:pic="http://schemas.openxmlformats.org/drawingml/2006/picture">
-            <wp:extent cx="5623560" cy="2249424"/>
+            <wp:extent cx="2880360" cy="1152144"/>
             <wp:docPr id="4" name="Picture 4"/>
             <wp:cNvGraphicFramePr>
               <a:graphicFrameLocks noChangeAspect="1"/>
@@ -580,7 +551,7 @@
                   <pic:spPr>
                     <a:xfrm>
                       <a:off x="0" y="0"/>
-                      <a:ext cx="5623560" cy="2249424"/>
+                      <a:ext cx="2880360" cy="1152144"/>
                     </a:xfrm>
                     <a:prstGeom prst="rect"/>
                   </pic:spPr>
@@ -666,19 +637,20 @@
     <w:tbl>
       <w:tblPr>
         <w:tblStyle w:val="TableGrid"/>
-        <w:tblW w:type="auto" w:w="0"/>
+        <w:tblW w:type="dxa" w:w="4536"/>
         <w:jc w:val="center"/>
+        <w:tblLayout w:type="fixed"/>
         <w:tblLook w:firstColumn="1" w:firstRow="1" w:lastColumn="0" w:lastRow="0" w:noHBand="0" w:noVBand="1" w:val="04A0"/>
       </w:tblPr>
       <w:tblGrid>
-        <w:gridCol w:w="3360"/>
-        <w:gridCol w:w="3360"/>
-        <w:gridCol w:w="3360"/>
+        <w:gridCol w:w="1512"/>
+        <w:gridCol w:w="1512"/>
+        <w:gridCol w:w="1512"/>
       </w:tblGrid>
       <w:tr>
         <w:tc>
           <w:tcPr>
-            <w:tcW w:type="dxa" w:w="3360"/>
+            <w:tcW w:type="dxa" w:w="1512"/>
             <w:shd w:fill="173B57"/>
             <w:vAlign w:val="center"/>
           </w:tcPr>
@@ -696,7 +668,7 @@
         </w:tc>
         <w:tc>
           <w:tcPr>
-            <w:tcW w:type="dxa" w:w="3360"/>
+            <w:tcW w:type="dxa" w:w="1512"/>
             <w:shd w:fill="173B57"/>
             <w:vAlign w:val="center"/>
           </w:tcPr>
@@ -714,7 +686,7 @@
         </w:tc>
         <w:tc>
           <w:tcPr>
-            <w:tcW w:type="dxa" w:w="3360"/>
+            <w:tcW w:type="dxa" w:w="1512"/>
             <w:shd w:fill="173B57"/>
             <w:vAlign w:val="center"/>
           </w:tcPr>
@@ -734,7 +706,7 @@
       <w:tr>
         <w:tc>
           <w:tcPr>
-            <w:tcW w:type="dxa" w:w="3360"/>
+            <w:tcW w:type="dxa" w:w="1512"/>
             <w:vAlign w:val="center"/>
           </w:tcPr>
           <w:p>
@@ -751,7 +723,7 @@
         </w:tc>
         <w:tc>
           <w:tcPr>
-            <w:tcW w:type="dxa" w:w="3360"/>
+            <w:tcW w:type="dxa" w:w="1512"/>
             <w:vAlign w:val="center"/>
           </w:tcPr>
           <w:p>
@@ -768,7 +740,7 @@
         </w:tc>
         <w:tc>
           <w:tcPr>
-            <w:tcW w:type="dxa" w:w="3360"/>
+            <w:tcW w:type="dxa" w:w="1512"/>
             <w:vAlign w:val="center"/>
           </w:tcPr>
           <w:p>
@@ -787,7 +759,7 @@
       <w:tr>
         <w:tc>
           <w:tcPr>
-            <w:tcW w:type="dxa" w:w="3360"/>
+            <w:tcW w:type="dxa" w:w="1512"/>
             <w:vAlign w:val="center"/>
           </w:tcPr>
           <w:p>
@@ -804,7 +776,7 @@
         </w:tc>
         <w:tc>
           <w:tcPr>
-            <w:tcW w:type="dxa" w:w="3360"/>
+            <w:tcW w:type="dxa" w:w="1512"/>
             <w:vAlign w:val="center"/>
           </w:tcPr>
           <w:p>
@@ -821,7 +793,7 @@
         </w:tc>
         <w:tc>
           <w:tcPr>
-            <w:tcW w:type="dxa" w:w="3360"/>
+            <w:tcW w:type="dxa" w:w="1512"/>
             <w:vAlign w:val="center"/>
           </w:tcPr>
           <w:p>
@@ -840,7 +812,7 @@
       <w:tr>
         <w:tc>
           <w:tcPr>
-            <w:tcW w:type="dxa" w:w="3360"/>
+            <w:tcW w:type="dxa" w:w="1512"/>
             <w:vAlign w:val="center"/>
           </w:tcPr>
           <w:p>
@@ -857,7 +829,7 @@
         </w:tc>
         <w:tc>
           <w:tcPr>
-            <w:tcW w:type="dxa" w:w="3360"/>
+            <w:tcW w:type="dxa" w:w="1512"/>
             <w:vAlign w:val="center"/>
           </w:tcPr>
           <w:p>
@@ -874,7 +846,7 @@
         </w:tc>
         <w:tc>
           <w:tcPr>
-            <w:tcW w:type="dxa" w:w="3360"/>
+            <w:tcW w:type="dxa" w:w="1512"/>
             <w:vAlign w:val="center"/>
           </w:tcPr>
           <w:p>
@@ -893,7 +865,7 @@
       <w:tr>
         <w:tc>
           <w:tcPr>
-            <w:tcW w:type="dxa" w:w="3360"/>
+            <w:tcW w:type="dxa" w:w="1512"/>
             <w:vAlign w:val="center"/>
           </w:tcPr>
           <w:p>
@@ -910,7 +882,7 @@
         </w:tc>
         <w:tc>
           <w:tcPr>
-            <w:tcW w:type="dxa" w:w="3360"/>
+            <w:tcW w:type="dxa" w:w="1512"/>
             <w:vAlign w:val="center"/>
           </w:tcPr>
           <w:p>
@@ -927,7 +899,7 @@
         </w:tc>
         <w:tc>
           <w:tcPr>
-            <w:tcW w:type="dxa" w:w="3360"/>
+            <w:tcW w:type="dxa" w:w="1512"/>
             <w:vAlign w:val="center"/>
           </w:tcPr>
           <w:p>
@@ -946,7 +918,7 @@
       <w:tr>
         <w:tc>
           <w:tcPr>
-            <w:tcW w:type="dxa" w:w="3360"/>
+            <w:tcW w:type="dxa" w:w="1512"/>
             <w:vAlign w:val="center"/>
           </w:tcPr>
           <w:p>
@@ -963,7 +935,7 @@
         </w:tc>
         <w:tc>
           <w:tcPr>
-            <w:tcW w:type="dxa" w:w="3360"/>
+            <w:tcW w:type="dxa" w:w="1512"/>
             <w:vAlign w:val="center"/>
           </w:tcPr>
           <w:p>
@@ -980,7 +952,7 @@
         </w:tc>
         <w:tc>
           <w:tcPr>
-            <w:tcW w:type="dxa" w:w="3360"/>
+            <w:tcW w:type="dxa" w:w="1512"/>
             <w:vAlign w:val="center"/>
           </w:tcPr>
           <w:p>
@@ -999,7 +971,7 @@
       <w:tr>
         <w:tc>
           <w:tcPr>
-            <w:tcW w:type="dxa" w:w="3360"/>
+            <w:tcW w:type="dxa" w:w="1512"/>
             <w:vAlign w:val="center"/>
           </w:tcPr>
           <w:p>
@@ -1016,7 +988,7 @@
         </w:tc>
         <w:tc>
           <w:tcPr>
-            <w:tcW w:type="dxa" w:w="3360"/>
+            <w:tcW w:type="dxa" w:w="1512"/>
             <w:vAlign w:val="center"/>
           </w:tcPr>
           <w:p>
@@ -1033,7 +1005,7 @@
         </w:tc>
         <w:tc>
           <w:tcPr>
-            <w:tcW w:type="dxa" w:w="3360"/>
+            <w:tcW w:type="dxa" w:w="1512"/>
             <w:vAlign w:val="center"/>
           </w:tcPr>
           <w:p>
@@ -1063,7 +1035,7 @@
       <w:r>
         <w:drawing>
           <wp:inline xmlns:a="http://schemas.openxmlformats.org/drawingml/2006/main" xmlns:pic="http://schemas.openxmlformats.org/drawingml/2006/picture">
-            <wp:extent cx="5623560" cy="1874520"/>
+            <wp:extent cx="2880360" cy="960120"/>
             <wp:docPr id="5" name="Picture 5"/>
             <wp:cNvGraphicFramePr>
               <a:graphicFrameLocks noChangeAspect="1"/>
@@ -1084,7 +1056,7 @@
                   <pic:spPr>
                     <a:xfrm>
                       <a:off x="0" y="0"/>
-                      <a:ext cx="5623560" cy="1874520"/>
+                      <a:ext cx="2880360" cy="960120"/>
                     </a:xfrm>
                     <a:prstGeom prst="rect"/>
                   </pic:spPr>
@@ -1114,7 +1086,7 @@
       <w:r>
         <w:drawing>
           <wp:inline xmlns:a="http://schemas.openxmlformats.org/drawingml/2006/main" xmlns:pic="http://schemas.openxmlformats.org/drawingml/2006/picture">
-            <wp:extent cx="5623560" cy="1874520"/>
+            <wp:extent cx="2880360" cy="960120"/>
             <wp:docPr id="6" name="Picture 6"/>
             <wp:cNvGraphicFramePr>
               <a:graphicFrameLocks noChangeAspect="1"/>
@@ -1135,7 +1107,7 @@
                   <pic:spPr>
                     <a:xfrm>
                       <a:off x="0" y="0"/>
-                      <a:ext cx="5623560" cy="1874520"/>
+                      <a:ext cx="2880360" cy="960120"/>
                     </a:xfrm>
                     <a:prstGeom prst="rect"/>
                   </pic:spPr>
@@ -1169,19 +1141,20 @@
     <w:tbl>
       <w:tblPr>
         <w:tblStyle w:val="TableGrid"/>
-        <w:tblW w:type="auto" w:w="0"/>
+        <w:tblW w:type="dxa" w:w="4536"/>
         <w:jc w:val="center"/>
+        <w:tblLayout w:type="fixed"/>
         <w:tblLook w:firstColumn="1" w:firstRow="1" w:lastColumn="0" w:lastRow="0" w:noHBand="0" w:noVBand="1" w:val="04A0"/>
       </w:tblPr>
       <w:tblGrid>
-        <w:gridCol w:w="3360"/>
-        <w:gridCol w:w="3360"/>
-        <w:gridCol w:w="3360"/>
+        <w:gridCol w:w="1512"/>
+        <w:gridCol w:w="1512"/>
+        <w:gridCol w:w="1512"/>
       </w:tblGrid>
       <w:tr>
         <w:tc>
           <w:tcPr>
-            <w:tcW w:type="dxa" w:w="3360"/>
+            <w:tcW w:type="dxa" w:w="1512"/>
             <w:shd w:fill="173B57"/>
             <w:vAlign w:val="center"/>
           </w:tcPr>
@@ -1199,7 +1172,7 @@
         </w:tc>
         <w:tc>
           <w:tcPr>
-            <w:tcW w:type="dxa" w:w="3360"/>
+            <w:tcW w:type="dxa" w:w="1512"/>
             <w:shd w:fill="173B57"/>
             <w:vAlign w:val="center"/>
           </w:tcPr>
@@ -1217,7 +1190,7 @@
         </w:tc>
         <w:tc>
           <w:tcPr>
-            <w:tcW w:type="dxa" w:w="3360"/>
+            <w:tcW w:type="dxa" w:w="1512"/>
             <w:shd w:fill="173B57"/>
             <w:vAlign w:val="center"/>
           </w:tcPr>
@@ -1237,7 +1210,7 @@
       <w:tr>
         <w:tc>
           <w:tcPr>
-            <w:tcW w:type="dxa" w:w="3360"/>
+            <w:tcW w:type="dxa" w:w="1512"/>
             <w:vAlign w:val="center"/>
           </w:tcPr>
           <w:p>
@@ -1254,7 +1227,7 @@
         </w:tc>
         <w:tc>
           <w:tcPr>
-            <w:tcW w:type="dxa" w:w="3360"/>
+            <w:tcW w:type="dxa" w:w="1512"/>
             <w:vAlign w:val="center"/>
           </w:tcPr>
           <w:p>
@@ -1271,7 +1244,7 @@
         </w:tc>
         <w:tc>
           <w:tcPr>
-            <w:tcW w:type="dxa" w:w="3360"/>
+            <w:tcW w:type="dxa" w:w="1512"/>
             <w:vAlign w:val="center"/>
           </w:tcPr>
           <w:p>
@@ -1290,7 +1263,7 @@
       <w:tr>
         <w:tc>
           <w:tcPr>
-            <w:tcW w:type="dxa" w:w="3360"/>
+            <w:tcW w:type="dxa" w:w="1512"/>
             <w:vAlign w:val="center"/>
           </w:tcPr>
           <w:p>
@@ -1307,7 +1280,7 @@
         </w:tc>
         <w:tc>
           <w:tcPr>
-            <w:tcW w:type="dxa" w:w="3360"/>
+            <w:tcW w:type="dxa" w:w="1512"/>
             <w:vAlign w:val="center"/>
           </w:tcPr>
           <w:p>
@@ -1324,7 +1297,7 @@
         </w:tc>
         <w:tc>
           <w:tcPr>
-            <w:tcW w:type="dxa" w:w="3360"/>
+            <w:tcW w:type="dxa" w:w="1512"/>
             <w:vAlign w:val="center"/>
           </w:tcPr>
           <w:p>
@@ -1354,7 +1327,7 @@
       <w:r>
         <w:drawing>
           <wp:inline xmlns:a="http://schemas.openxmlformats.org/drawingml/2006/main" xmlns:pic="http://schemas.openxmlformats.org/drawingml/2006/picture">
-            <wp:extent cx="5623560" cy="2811780"/>
+            <wp:extent cx="2880360" cy="1440180"/>
             <wp:docPr id="7" name="Picture 7"/>
             <wp:cNvGraphicFramePr>
               <a:graphicFrameLocks noChangeAspect="1"/>
@@ -1375,7 +1348,7 @@
                   <pic:spPr>
                     <a:xfrm>
                       <a:off x="0" y="0"/>
-                      <a:ext cx="5623560" cy="2811780"/>
+                      <a:ext cx="2880360" cy="1440180"/>
                     </a:xfrm>
                     <a:prstGeom prst="rect"/>
                   </pic:spPr>
@@ -1405,7 +1378,7 @@
       <w:r>
         <w:drawing>
           <wp:inline xmlns:a="http://schemas.openxmlformats.org/drawingml/2006/main" xmlns:pic="http://schemas.openxmlformats.org/drawingml/2006/picture">
-            <wp:extent cx="5623560" cy="4686300"/>
+            <wp:extent cx="2880360" cy="2400300"/>
             <wp:docPr id="8" name="Picture 8"/>
             <wp:cNvGraphicFramePr>
               <a:graphicFrameLocks noChangeAspect="1"/>
@@ -1426,7 +1399,7 @@
                   <pic:spPr>
                     <a:xfrm>
                       <a:off x="0" y="0"/>
-                      <a:ext cx="5623560" cy="4686300"/>
+                      <a:ext cx="2880360" cy="2400300"/>
                     </a:xfrm>
                     <a:prstGeom prst="rect"/>
                   </pic:spPr>
@@ -1456,7 +1429,7 @@
       <w:r>
         <w:drawing>
           <wp:inline xmlns:a="http://schemas.openxmlformats.org/drawingml/2006/main" xmlns:pic="http://schemas.openxmlformats.org/drawingml/2006/picture">
-            <wp:extent cx="5623560" cy="4686300"/>
+            <wp:extent cx="2880360" cy="2400300"/>
             <wp:docPr id="9" name="Picture 9"/>
             <wp:cNvGraphicFramePr>
               <a:graphicFrameLocks noChangeAspect="1"/>
@@ -1477,7 +1450,7 @@
                   <pic:spPr>
                     <a:xfrm>
                       <a:off x="0" y="0"/>
-                      <a:ext cx="5623560" cy="4686300"/>
+                      <a:ext cx="2880360" cy="2400300"/>
                     </a:xfrm>
                     <a:prstGeom prst="rect"/>
                   </pic:spPr>
@@ -1614,8 +1587,8 @@
       <w:headerReference w:type="default" r:id="rId9"/>
       <w:footerReference w:type="default" r:id="rId10"/>
       <w:pgSz w:w="12240" w:h="15840"/>
-      <w:pgMar w:top="1008" w:right="1080" w:bottom="1008" w:left="1080" w:header="720" w:footer="720" w:gutter="0"/>
-      <w:cols w:space="720"/>
+      <w:pgMar w:top="936" w:right="1008" w:bottom="936" w:left="1008" w:header="720" w:footer="720" w:gutter="0"/>
+      <w:cols w:space="540" w:num="2"/>
       <w:docGrid w:linePitch="360"/>
     </w:sectPr>
   </w:body>
@@ -1631,10 +1604,11 @@
     </w:pPr>
     <w:r>
       <w:rPr>
-        <w:color w:val="64748B"/>
+        <w:rFonts w:ascii="Times New Roman" w:hAnsi="Times New Roman"/>
+        <w:color w:val="000000"/>
         <w:sz w:val="16"/>
       </w:rPr>
-      <w:t>Classification-only pipeline • Generated from reproducible run artifacts</w:t>
+      <w:t>MAIT Mini Project</w:t>
     </w:r>
   </w:p>
 </w:ftr>
@@ -1648,10 +1622,11 @@
     </w:pPr>
     <w:r>
       <w:rPr>
-        <w:color w:val="64748B"/>
+        <w:rFonts w:ascii="Times New Roman" w:hAnsi="Times New Roman"/>
+        <w:color w:val="000000"/>
         <w:sz w:val="16"/>
       </w:rPr>
-      <w:t>GTSRB Traffic-Sign Recognition | MAIT Mini Project</w:t>
+      <w:t>GTSRB Traffic Sign Recognition</w:t>
     </w:r>
   </w:p>
 </w:hdr>
@@ -2020,10 +1995,13 @@
     <w:name w:val="Normal"/>
     <w:qFormat/>
     <w:rsid w:val="00FC693F"/>
+    <w:pPr>
+      <w:spacing w:line="240" w:lineRule="auto"/>
+    </w:pPr>
     <w:rPr>
-      <w:rFonts w:ascii="Aptos" w:hAnsi="Aptos"/>
-      <w:color w:val="1F2937"/>
-      <w:sz w:val="21"/>
+      <w:rFonts w:ascii="Times New Roman" w:hAnsi="Times New Roman" w:eastAsia="Times New Roman"/>
+      <w:color w:val="000000"/>
+      <w:sz w:val="20"/>
     </w:rPr>
   </w:style>
   <w:style w:type="paragraph" w:styleId="Header">
@@ -2081,15 +2059,16 @@
     <w:pPr>
       <w:keepNext/>
       <w:keepLines/>
-      <w:spacing w:before="480" w:after="0"/>
+      <w:spacing w:before="120" w:after="60"/>
       <w:outlineLvl w:val="0"/>
     </w:pPr>
     <w:rPr>
-      <w:rFonts w:asciiTheme="majorHAnsi" w:eastAsiaTheme="majorEastAsia" w:hAnsiTheme="majorHAnsi" w:cstheme="majorBidi" w:ascii="Aptos Display" w:hAnsi="Aptos Display"/>
+      <w:rFonts w:asciiTheme="majorHAnsi" w:eastAsiaTheme="majorEastAsia" w:hAnsiTheme="majorHAnsi" w:cstheme="majorBidi" w:ascii="Times New Roman" w:hAnsi="Times New Roman" w:eastAsia="Times New Roman"/>
       <w:b/>
       <w:bCs/>
-      <w:color w:val="173B57"/>
-      <w:sz w:val="34"/>
+      <w:caps/>
+      <w:color w:val="000000"/>
+      <w:sz w:val="20"/>
       <w:szCs w:val="28"/>
     </w:rPr>
   </w:style>
@@ -2105,15 +2084,15 @@
     <w:pPr>
       <w:keepNext/>
       <w:keepLines/>
-      <w:spacing w:before="200" w:after="0"/>
+      <w:spacing w:before="120" w:after="60"/>
       <w:outlineLvl w:val="1"/>
     </w:pPr>
     <w:rPr>
-      <w:rFonts w:asciiTheme="majorHAnsi" w:eastAsiaTheme="majorEastAsia" w:hAnsiTheme="majorHAnsi" w:cstheme="majorBidi" w:ascii="Aptos Display" w:hAnsi="Aptos Display"/>
+      <w:rFonts w:asciiTheme="majorHAnsi" w:eastAsiaTheme="majorEastAsia" w:hAnsiTheme="majorHAnsi" w:cstheme="majorBidi" w:ascii="Times New Roman" w:hAnsi="Times New Roman" w:eastAsia="Times New Roman"/>
       <w:b/>
       <w:bCs/>
-      <w:color w:val="0F766E"/>
-      <w:sz w:val="26"/>
+      <w:color w:val="000000"/>
+      <w:sz w:val="20"/>
       <w:szCs w:val="26"/>
     </w:rPr>
   </w:style>
@@ -2367,19 +2346,16 @@
     <w:qFormat/>
     <w:rsid w:val="00FC693F"/>
     <w:pPr>
-      <w:pBdr>
-        <w:bottom w:val="single" w:sz="8" w:space="4" w:color="4F81BD" w:themeColor="accent1"/>
-      </w:pBdr>
-      <w:spacing w:after="300" w:line="240" w:lineRule="auto"/>
+      <w:spacing w:after="60" w:line="240" w:lineRule="auto" w:before="120"/>
       <w:contextualSpacing/>
     </w:pPr>
     <w:rPr>
-      <w:rFonts w:asciiTheme="majorHAnsi" w:eastAsiaTheme="majorEastAsia" w:hAnsiTheme="majorHAnsi" w:cstheme="majorBidi" w:ascii="Aptos Display" w:hAnsi="Aptos Display"/>
+      <w:rFonts w:asciiTheme="majorHAnsi" w:eastAsiaTheme="majorEastAsia" w:hAnsiTheme="majorHAnsi" w:cstheme="majorBidi" w:ascii="Times New Roman" w:hAnsi="Times New Roman" w:eastAsia="Times New Roman"/>
       <w:b/>
-      <w:color w:val="173B57"/>
+      <w:color w:val="000000"/>
       <w:spacing w:val="5"/>
       <w:kern w:val="28"/>
-      <w:sz w:val="52"/>
+      <w:sz w:val="36"/>
       <w:szCs w:val="52"/>
     </w:rPr>
   </w:style>

</xml_diff>